<commit_message>
Updated proper input document
</commit_message>
<xml_diff>
--- a/Digital-Signature/Remove-digital-signature/.NET/Remove-digital-signature/Data/SignedDocument.docx
+++ b/Digital-Signature/Remove-digital-signature/.NET/Remove-digital-signature/Data/SignedDocument.docx
@@ -430,7 +430,7 @@
             <v:imagedata r:id="rId1" o:title=""/>
             <w10:wrap type="none"/>
             <o:lock v:ext="edit" ungrouping="t" rotation="t" cropping="t" verticies="t" text="t" grouping="t"/>
-            <o:signatureline id="{D32A28F2-10BE-4C65-84C9-30D36DF4CB91}" provid="{00000000-0000-0000-0000-000000000000}" o:suggestedsigner="Tony" o:suggestedsigner2="Approver" o:suggestedsigneremail="Tony@example.com" signinginstructions="Please review and sign." allowcomments="f" showsigndate="t" issignatureline="t" defaultinstructions="t"/>
+            <o:signatureline id="{47BC5C8C-961A-4AA5-BA6D-90F444E365F6}" provid="{00000000-0000-0000-0000-000000000000}" o:suggestedsigner="Tony" o:suggestedsigner2="Approver" o:suggestedsigneremail="Tony@example.com" signinginstructions="Please review and sign." allowcomments="f" showsigndate="t" issignatureline="t" defaultinstructions="t"/>
           </v:shape>
         </w:pict>
       </w:r>
@@ -447,7 +447,7 @@
             <v:imagedata r:id="rId2" o:title=""/>
             <w10:wrap type="none"/>
             <o:lock v:ext="edit" ungrouping="t" rotation="t" cropping="t" verticies="t" text="t" grouping="t"/>
-            <o:signatureline id="{78FA2E14-38B5-4AFA-B5EE-CC6B0AB790CF}" provid="{00000000-0000-0000-0000-000000000000}" o:suggestedsigner="Steve" o:suggestedsigner2="Approver" o:suggestedsigneremail="Steve@example.com" signinginstructions="Please review and sign." allowcomments="f" showsigndate="t" issignatureline="t" defaultinstructions="t"/>
+            <o:signatureline id="{E970CADE-6A2D-446F-A0C5-C9BD40427388}" provid="{00000000-0000-0000-0000-000000000000}" o:suggestedsigner="Steve" o:suggestedsigner2="Approver" o:suggestedsigneremail="Steve@example.com" signinginstructions="Please review and sign." allowcomments="f" showsigndate="t" issignatureline="t" defaultinstructions="t"/>
           </v:shape>
         </w:pict>
       </w:r>
@@ -464,7 +464,7 @@
             <v:imagedata r:id="rId3" o:title=""/>
             <w10:wrap type="none"/>
             <o:lock v:ext="edit" ungrouping="t" rotation="t" cropping="t" verticies="t" text="t" grouping="t"/>
-            <o:signatureline id="{374F6303-9478-471B-A976-226C8D34061B}" provid="{00000000-0000-0000-0000-000000000000}" o:suggestedsigner="Bruce" o:suggestedsigner2="Approver" o:suggestedsigneremail="Bruce@example.com" signinginstructions="Please review and sign." allowcomments="f" showsigndate="t" issignatureline="t" defaultinstructions="t"/>
+            <o:signatureline id="{4CC158BF-95CC-4146-93AA-E2ED19DD912B}" provid="{00000000-0000-0000-0000-000000000000}" o:suggestedsigner="Bruce" o:suggestedsigner2="Approver" o:suggestedsigneremail="Bruce@example.com" signinginstructions="Please review and sign." allowcomments="f" showsigndate="t" issignatureline="t" defaultinstructions="t"/>
           </v:shape>
         </w:pict>
       </w:r>
@@ -1723,14 +1723,14 @@
     <SignatureMethod Algorithm="http://www.w3.org/2001/04/xmldsig-more#rsa-sha256"/>
     <Reference Type="http://www.w3.org/2000/09/xmldsig#Object" URI="#idPackageObject">
       <DigestMethod Algorithm="http://www.w3.org/2001/04/xmlenc#sha256"/>
-      <DigestValue>z9dPzHch+1x28WTbvstl3fW6Uot1TPBGFxQtIumJuK0=</DigestValue>
+      <DigestValue>Iw11xyKxFjzwnOSmVRlBbG94MWJ/38sGvpTjBTzUiRw=</DigestValue>
     </Reference>
     <Reference Type="http://www.w3.org/2000/09/xmldsig#Object" URI="#idOfficeObject">
       <DigestMethod Algorithm="http://www.w3.org/2001/04/xmlenc#sha256"/>
-      <DigestValue>vbngXbKthSPaHXEyWAyP1VqytrJEnEPGj0IVRro4fYQ=</DigestValue>
+      <DigestValue>YXPk5OeY4RMgxKHPkGmzqATlX+sB2hESYd4EOR6JLgE=</DigestValue>
     </Reference>
   </SignedInfo>
-  <SignatureValue>jQ98tuN0OuymjCv8cfR1LR+CXQNSLKzSYHzh740rNMLNTtz04CJBAj5uYgUAJfcrVtn/JyFAcuSTdsNCcISlFB3zCiDTPO/jRrIEVcF6XquslaCvOnyxKE5DXZk7IAHP/7azJp1ZCZyjotwyHR/oGrPuzDj38I0FE5zKTP08Zq9Px1xtfyBewcFXOY6nhpn8PScO9Ubmw5VuLtQn2td6E0re364EV8uiRJkXvDxJmd7DO3G0LyM/KrhBWeg6+KlhR5/1YHEWKjyFdSD+rd4FMFLEOeK4yrG47x93wA6h6jc8mjT46IkVH6mnsRByTmHvvtxDFeDC44YQ5pT1gkgckw==</SignatureValue>
+  <SignatureValue>LWNCMxfdXKEUcwYWYQjXiyG1jr/1S93PLNFoUnEzqwJUvpVCQVBkD7tcEScHf1A29oA2GhEsETAWMG8B1XFCludaJEHEuEEoBHVIEZW+8QzfupEFEeg3vWMscpsav6JdHhm6/umm4dCGFlW6US+Bots9NaCcoRGBGOEivdkH/ty/KsF5BKX6AC6KNkA+tS1WZAzrgdWdjDhvBAPGU6TlG7lfAW6pyS4H0KyltIjlqoDerwqAVYfXgNJZSQNYVejJCDibmSF88aC7I1TRiyI6vLdr/SuC+5Cl2akCr9IzUAEqluzOy4fmbmxs/qOQM3f4phyDSqYs5jwFoaj/8DTbRg==</SignatureValue>
   <KeyInfo>
     <X509Data>
       <X509Certificate>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</X509Certificate>
@@ -1766,7 +1766,7 @@
       </Reference>
       <Reference URI="/word/document.xml?ContentType=application/vnd.openxmlformats-officedocument.wordprocessingml.document.main+xml">
         <DigestMethod Algorithm="http://www.w3.org/2001/04/xmlenc#sha256"/>
-        <DigestValue>f+gfMW3Ugz67DOrWtFEuoK1WNbkmWJtqQmaldMZBHNY=</DigestValue>
+        <DigestValue>yXSObPVDA3m3h1mvejhhVnCdoqcScPw5cUrs/csxHIk=</DigestValue>
       </Reference>
       <Reference URI="/word/fontTable.xml?ContentType=application/vnd.openxmlformats-officedocument.wordprocessingml.fontTable+xml">
         <DigestMethod Algorithm="http://www.w3.org/2001/04/xmlenc#sha256"/>
@@ -1801,7 +1801,7 @@
       <SignatureProperty Id="idSignatureTime" Target="#idPackageSignature">
         <mdssi:SignatureTime>
           <mdssi:Format>YYYY-MM-DDThh:mm:ssTZD</mdssi:Format>
-          <mdssi:Value>2026-09-23T16:24:18Z</mdssi:Value>
+          <mdssi:Value>2026-09-24T10:49:07Z</mdssi:Value>
         </mdssi:SignatureTime>
       </SignatureProperty>
     </SignatureProperties>
@@ -1810,7 +1810,7 @@
     <SignatureProperties>
       <SignatureProperty Id="idOfficeV1Details" Target="#idPackageSignature">
         <SignatureInfoV1 xmlns="http://schemas.microsoft.com/office/2006/digsig">
-          <SetupID>{D32A28F2-10BE-4C65-84C9-30D36DF4CB91}</SetupID>
+          <SetupID>{47BC5C8C-961A-4AA5-BA6D-90F444E365F6}</SetupID>
           <SignatureText/>
           <SignatureImage>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</SignatureImage>
           <SignatureComments>Approved</SignatureComments>
@@ -1839,14 +1839,14 @@
     <SignatureMethod Algorithm="http://www.w3.org/2001/04/xmldsig-more#rsa-sha256"/>
     <Reference Type="http://www.w3.org/2000/09/xmldsig#Object" URI="#idPackageObject">
       <DigestMethod Algorithm="http://www.w3.org/2001/04/xmlenc#sha256"/>
-      <DigestValue>p8mV9gubCNgDqEGnJnW74NmxsuvKbvjBvsbRr+GEiCU=</DigestValue>
+      <DigestValue>Iw11xyKxFjzwnOSmVRlBbG94MWJ/38sGvpTjBTzUiRw=</DigestValue>
     </Reference>
     <Reference Type="http://www.w3.org/2000/09/xmldsig#Object" URI="#idOfficeObject">
       <DigestMethod Algorithm="http://www.w3.org/2001/04/xmlenc#sha256"/>
-      <DigestValue>c/PDZmWkZwbDcwpi+GGMvlzHp8jEn6KMK8G8G+9116M=</DigestValue>
+      <DigestValue>atijTmQzV+tnd8bny03RKw/HAL1RLiOsp0unVWdCWIg=</DigestValue>
     </Reference>
   </SignedInfo>
-  <SignatureValue>Rdk4UpOeK2YoQdb8RC/i1/c1Qfnk24OwQ4sXo68AvHhyIuh2tdKG4j9gGtMoEFpZULtsHOD+zyqrO3xNx3KqLqoGWcCO/meT93iWo/q3ukUcXW5YJRfMYLnXXxXvdUE6B0caAPpM6VgCbHP73/O9nbLpTFpDvER34HFFmkjlV3R8esqpE1wNHuZ1j++M/YV80CA7F7fZyfEJNxN9wSYDmVo1B4MemeAzIcDrlzCQxdOaKHvha2N5il25RzT71Qu1QI/NeVjB73RrCQiMzBGN0NxfY/IGDoN4wPhK7S0faNMwT32r7AgohQmEJSOBvXHqUTVea1XgqphMOCjjmvHK3g==</SignatureValue>
+  <SignatureValue>OEOR6ZcETCFXVpjegkeyPHsTWYuQ1qSaNydRmiYTCTzgKyJs7IEwoczIG+fp4aVgIWAbQokBzjV/NH6K3oDuJnGnyK/+bD8GxozNXb8zx7I7VPvQP2t9/sKBptV28HaeMw2g4rvrPekpn4gVvlJkQhn8tmbCG0SfAdcHLuwDa4gaveXs4E+1iynls6KeR32Ulv3UTFQDSn/WPwOb9wnrvnXhlXwVnbweEb1st8gX51qFg59Kafh4SZ8ZOYJ8JJByB/dXQJUvGrjrdpxkPORxGEfREEQxOiFO22KJEaH0917NUmfh3xi9NRVpnaldZvP0OflM8LQZ5aXRFBS4Ozpxjg==</SignatureValue>
   <KeyInfo>
     <X509Data>
       <X509Certificate>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</X509Certificate>
@@ -1882,7 +1882,7 @@
       </Reference>
       <Reference URI="/word/document.xml?ContentType=application/vnd.openxmlformats-officedocument.wordprocessingml.document.main+xml">
         <DigestMethod Algorithm="http://www.w3.org/2001/04/xmlenc#sha256"/>
-        <DigestValue>f+gfMW3Ugz67DOrWtFEuoK1WNbkmWJtqQmaldMZBHNY=</DigestValue>
+        <DigestValue>yXSObPVDA3m3h1mvejhhVnCdoqcScPw5cUrs/csxHIk=</DigestValue>
       </Reference>
       <Reference URI="/word/fontTable.xml?ContentType=application/vnd.openxmlformats-officedocument.wordprocessingml.fontTable+xml">
         <DigestMethod Algorithm="http://www.w3.org/2001/04/xmlenc#sha256"/>
@@ -1917,7 +1917,7 @@
       <SignatureProperty Id="idSignatureTime" Target="#idPackageSignature">
         <mdssi:SignatureTime>
           <mdssi:Format>YYYY-MM-DDThh:mm:ssTZD</mdssi:Format>
-          <mdssi:Value>2026-09-23T16:24:31Z</mdssi:Value>
+          <mdssi:Value>2026-09-24T10:49:07Z</mdssi:Value>
         </mdssi:SignatureTime>
       </SignatureProperty>
     </SignatureProperties>
@@ -1926,7 +1926,7 @@
     <SignatureProperties>
       <SignatureProperty Id="idOfficeV1Details" Target="#idPackageSignature">
         <SignatureInfoV1 xmlns="http://schemas.microsoft.com/office/2006/digsig">
-          <SetupID>{E991D0AE-15F4-4107-854C-E8EB24BBE7B5}</SetupID>
+          <SetupID>{E970CADE-6A2D-446F-A0C5-C9BD40427388}</SetupID>
           <SignatureText/>
           <SignatureImage>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</SignatureImage>
           <SignatureComments>Approved</SignatureComments>
@@ -1955,14 +1955,14 @@
     <SignatureMethod Algorithm="http://www.w3.org/2001/04/xmldsig-more#rsa-sha256"/>
     <Reference Type="http://www.w3.org/2000/09/xmldsig#Object" URI="#idPackageObject">
       <DigestMethod Algorithm="http://www.w3.org/2001/04/xmlenc#sha256"/>
-      <DigestValue>UtAWAnKfXN7sqOqjyVud/5s3E7uku+ONG9o/aY9zS6E=</DigestValue>
+      <DigestValue>Iw11xyKxFjzwnOSmVRlBbG94MWJ/38sGvpTjBTzUiRw=</DigestValue>
     </Reference>
     <Reference Type="http://www.w3.org/2000/09/xmldsig#Object" URI="#idOfficeObject">
       <DigestMethod Algorithm="http://www.w3.org/2001/04/xmlenc#sha256"/>
-      <DigestValue>XuJ3F2swU2SBVIBM/RMUeZWja77pRNS4GeIgHnf8Nx8=</DigestValue>
+      <DigestValue>HlFAtp1AP+LwYuFLFwKhcHg5JKk+jax5AxhDHkR+y1k=</DigestValue>
     </Reference>
   </SignedInfo>
-  <SignatureValue>DvxK19xlrh6Cy8ReG7IPfGr5pQHxsuFmIvnLMn3PqR4WdMCuXoA9R/X55yr47V0whLTlRfhIOoCaC3XaBQ8XLclDmFsb1L7txbBn17jAoEsC5cngaCPDtFYQZ2FHwG8PNm9NZ77AXIBs6PL4QE2eohEDnExE3tOzQ6Jzk1T0hvGOlxHCdBSJqbXo/BRCcUg6+uZDEEKCG4SroiTn0ANeO8SNM4H5v9g84GR3BYAQukLaz0zSWpmnIkXFaE9ZsjuM9VknSRc5e3lAaN3/x+pN9Pf3N8lbRcy15PU4LwOqOJx+Gxx7sx3L5t3U1X/dvaqkMjREvEXgshCHhe6NLu9IfQ==</SignatureValue>
+  <SignatureValue>SPtEXgB2l40wmqw9hb8JcC4PpB2vOg9awFFDIn1kQExdJ5C/fYgui3H2kcwnVlmmD+Qpm8gRdU9qkyExAbH+ykEmq+gROxM+3Ar/8zratn5bG8GwhXlaCEBI4PiuAytK2SAl6aO2UWO2YiKYmZGBcVKnwo7q8Sj56z3ZLWHDBVsul3aIRBNah0J6N0v269SYjLnuyfMjjrjPUWzGy0CmHA6Niex6itPiVDDyAzyOswCm0rWAoSjkDsqVvAdP45pJ6p1wDoNXB2dC7XGaOs273Abb1HlEuU3Gt/Y8gEnOOaL+UkfxFEIAaL5wuZaRr4HyPlx2fCDgVbVv5u2qxtg3+w==</SignatureValue>
   <KeyInfo>
     <X509Data>
       <X509Certificate>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</X509Certificate>
@@ -1998,7 +1998,7 @@
       </Reference>
       <Reference URI="/word/document.xml?ContentType=application/vnd.openxmlformats-officedocument.wordprocessingml.document.main+xml">
         <DigestMethod Algorithm="http://www.w3.org/2001/04/xmlenc#sha256"/>
-        <DigestValue>f+gfMW3Ugz67DOrWtFEuoK1WNbkmWJtqQmaldMZBHNY=</DigestValue>
+        <DigestValue>yXSObPVDA3m3h1mvejhhVnCdoqcScPw5cUrs/csxHIk=</DigestValue>
       </Reference>
       <Reference URI="/word/fontTable.xml?ContentType=application/vnd.openxmlformats-officedocument.wordprocessingml.fontTable+xml">
         <DigestMethod Algorithm="http://www.w3.org/2001/04/xmlenc#sha256"/>
@@ -2033,7 +2033,7 @@
       <SignatureProperty Id="idSignatureTime" Target="#idPackageSignature">
         <mdssi:SignatureTime>
           <mdssi:Format>YYYY-MM-DDThh:mm:ssTZD</mdssi:Format>
-          <mdssi:Value>2026-09-23T16:24:38Z</mdssi:Value>
+          <mdssi:Value>2026-09-24T10:49:07Z</mdssi:Value>
         </mdssi:SignatureTime>
       </SignatureProperty>
     </SignatureProperties>
@@ -2042,7 +2042,7 @@
     <SignatureProperties>
       <SignatureProperty Id="idOfficeV1Details" Target="#idPackageSignature">
         <SignatureInfoV1 xmlns="http://schemas.microsoft.com/office/2006/digsig">
-          <SetupID>{374F6303-9478-471B-A976-226C8D34061B}</SetupID>
+          <SetupID>{4CC158BF-95CC-4146-93AA-E2ED19DD912B}</SetupID>
           <SignatureText/>
           <SignatureImage>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</SignatureImage>
           <SignatureComments>Approved</SignatureComments>

</xml_diff>